<commit_message>
Update XJTLU docker installation guidance.docx
</commit_message>
<xml_diff>
--- a/XJTLU docker installation guidance.docx
+++ b/XJTLU docker installation guidance.docx
@@ -33,7 +33,21 @@
         <w:rPr>
           <w:rFonts w:ascii="Times" w:eastAsia="SimSun" w:hAnsi="Times" w:cs="Times New Roman"/>
         </w:rPr>
-        <w:t>Author: Zhennong Chen, Xingyi Yao</w:t>
+        <w:t xml:space="preserve">Author: Zhennong Chen, </w:t>
+      </w:r>
+      <w:proofErr w:type="spellStart"/>
+      <w:r>
+        <w:rPr>
+          <w:rFonts w:ascii="Times" w:eastAsia="SimSun" w:hAnsi="Times" w:cs="Times New Roman"/>
+        </w:rPr>
+        <w:t>Xingyi</w:t>
+      </w:r>
+      <w:proofErr w:type="spellEnd"/>
+      <w:r>
+        <w:rPr>
+          <w:rFonts w:ascii="Times" w:eastAsia="SimSun" w:hAnsi="Times" w:cs="Times New Roman"/>
+        </w:rPr>
+        <w:t xml:space="preserve"> Yao</w:t>
       </w:r>
     </w:p>
     <w:p>
@@ -83,12 +97,14 @@
         </w:rPr>
         <w:t>下载</w:t>
       </w:r>
+      <w:proofErr w:type="spellStart"/>
       <w:r>
         <w:rPr>
           <w:rFonts w:ascii="Times" w:eastAsia="SimSun" w:hAnsi="Times" w:cs="SimSun" w:hint="eastAsia"/>
         </w:rPr>
         <w:t>Github</w:t>
       </w:r>
+      <w:proofErr w:type="spellEnd"/>
       <w:r>
         <w:rPr>
           <w:rFonts w:ascii="Times" w:eastAsia="SimSun" w:hAnsi="Times" w:cs="SimSun"/>
@@ -127,15 +143,25 @@
         </w:rPr>
         <w:t>在</w:t>
       </w:r>
-      <w:hyperlink r:id="rId5" w:history="1">
-        <w:r>
-          <w:rPr>
-            <w:rStyle w:val="Hyperlink"/>
-            <w:rFonts w:ascii="Times" w:eastAsia="SimSun" w:hAnsi="Times" w:cs="SimSun"/>
-          </w:rPr>
-          <w:t>https://github.com/zhennongchen/Standard_dockers.git</w:t>
-        </w:r>
-      </w:hyperlink>
+      <w:r>
+        <w:fldChar w:fldCharType="begin"/>
+      </w:r>
+      <w:r>
+        <w:instrText>HYPERLINK "https://github.com/zhennongchen/Standard_dockers.git"</w:instrText>
+      </w:r>
+      <w:r>
+        <w:fldChar w:fldCharType="separate"/>
+      </w:r>
+      <w:r>
+        <w:rPr>
+          <w:rStyle w:val="Hyperlink"/>
+          <w:rFonts w:ascii="Times" w:eastAsia="SimSun" w:hAnsi="Times" w:cs="SimSun"/>
+        </w:rPr>
+        <w:t>https://github.com/zhennongchen/Standard_dockers.git</w:t>
+      </w:r>
+      <w:r>
+        <w:fldChar w:fldCharType="end"/>
+      </w:r>
       <w:r>
         <w:rPr>
           <w:rFonts w:ascii="Times" w:eastAsia="SimSun" w:hAnsi="Times" w:cs="SimSun" w:hint="eastAsia"/>
@@ -164,7 +190,21 @@
         <w:rPr>
           <w:rFonts w:ascii="Times" w:eastAsia="SimSun" w:hAnsi="Times" w:cs="SimSun"/>
         </w:rPr>
-        <w:t xml:space="preserve"> with Github Desktop</w:t>
+        <w:t xml:space="preserve"> with </w:t>
+      </w:r>
+      <w:proofErr w:type="spellStart"/>
+      <w:r>
+        <w:rPr>
+          <w:rFonts w:ascii="Times" w:eastAsia="SimSun" w:hAnsi="Times" w:cs="SimSun"/>
+        </w:rPr>
+        <w:t>Github</w:t>
+      </w:r>
+      <w:proofErr w:type="spellEnd"/>
+      <w:r>
+        <w:rPr>
+          <w:rFonts w:ascii="Times" w:eastAsia="SimSun" w:hAnsi="Times" w:cs="SimSun"/>
+        </w:rPr>
+        <w:t xml:space="preserve"> Desktop</w:t>
       </w:r>
       <w:r>
         <w:rPr>
@@ -356,12 +396,14 @@
           <w:rFonts w:ascii="Times" w:eastAsia="Times New Roman" w:hAnsi="Times" w:cs="Times New Roman"/>
         </w:rPr>
       </w:pPr>
+      <w:proofErr w:type="spellStart"/>
       <w:r>
         <w:rPr>
           <w:rFonts w:ascii="Times" w:eastAsia="Times New Roman" w:hAnsi="Times" w:cs="Times New Roman"/>
         </w:rPr>
         <w:t>nvidia-smi</w:t>
       </w:r>
+      <w:proofErr w:type="spellEnd"/>
     </w:p>
     <w:p>
       <w:pPr>
@@ -732,34 +774,44 @@
         </w:rPr>
         <w:t>先确认</w:t>
       </w:r>
+      <w:proofErr w:type="spellStart"/>
       <w:r>
         <w:rPr>
           <w:rFonts w:ascii="Times" w:eastAsia="SimSun" w:hAnsi="Times" w:cs="Times New Roman" w:hint="eastAsia"/>
         </w:rPr>
         <w:t>wsl</w:t>
       </w:r>
+      <w:proofErr w:type="spellEnd"/>
       <w:r>
         <w:rPr>
           <w:rFonts w:ascii="Times" w:eastAsia="SimSun" w:hAnsi="Times" w:cs="Times New Roman" w:hint="eastAsia"/>
         </w:rPr>
         <w:t>是否需要更新：</w:t>
       </w:r>
+      <w:proofErr w:type="spellStart"/>
       <w:r>
         <w:rPr>
           <w:rFonts w:ascii="Times" w:eastAsia="SimSun" w:hAnsi="Times" w:cs="Times New Roman" w:hint="eastAsia"/>
         </w:rPr>
-        <w:t xml:space="preserve">wsl </w:t>
-      </w:r>
-      <w:r>
-        <w:rPr>
-          <w:rFonts w:ascii="Times" w:eastAsia="SimSun" w:hAnsi="Times" w:cs="Times New Roman"/>
-        </w:rPr>
-        <w:t>–</w:t>
-      </w:r>
+        <w:t>wsl</w:t>
+      </w:r>
+      <w:proofErr w:type="spellEnd"/>
       <w:r>
         <w:rPr>
           <w:rFonts w:ascii="Times" w:eastAsia="SimSun" w:hAnsi="Times" w:cs="Times New Roman" w:hint="eastAsia"/>
         </w:rPr>
+        <w:t xml:space="preserve"> </w:t>
+      </w:r>
+      <w:r>
+        <w:rPr>
+          <w:rFonts w:ascii="Times" w:eastAsia="SimSun" w:hAnsi="Times" w:cs="Times New Roman" w:hint="eastAsia"/>
+        </w:rPr>
+        <w:t>--</w:t>
+      </w:r>
+      <w:r>
+        <w:rPr>
+          <w:rFonts w:ascii="Times" w:eastAsia="SimSun" w:hAnsi="Times" w:cs="Times New Roman" w:hint="eastAsia"/>
+        </w:rPr>
         <w:t>update</w:t>
       </w:r>
     </w:p>
@@ -786,13 +838,23 @@
           <w:bCs/>
         </w:rPr>
       </w:pPr>
-      <w:r>
-        <w:rPr>
-          <w:rFonts w:ascii="Times" w:eastAsia="Times New Roman" w:hAnsi="Times" w:cs="Times New Roman"/>
-          <w:b/>
-          <w:bCs/>
-        </w:rPr>
-        <w:t>wsl --install -d Ubuntu-22.04</w:t>
+      <w:proofErr w:type="spellStart"/>
+      <w:r>
+        <w:rPr>
+          <w:rFonts w:ascii="Times" w:eastAsia="Times New Roman" w:hAnsi="Times" w:cs="Times New Roman"/>
+          <w:b/>
+          <w:bCs/>
+        </w:rPr>
+        <w:t>wsl</w:t>
+      </w:r>
+      <w:proofErr w:type="spellEnd"/>
+      <w:r>
+        <w:rPr>
+          <w:rFonts w:ascii="Times" w:eastAsia="Times New Roman" w:hAnsi="Times" w:cs="Times New Roman"/>
+          <w:b/>
+          <w:bCs/>
+        </w:rPr>
+        <w:t xml:space="preserve"> --install -d Ubuntu-22.04</w:t>
       </w:r>
     </w:p>
     <w:p>
@@ -1019,6 +1081,7 @@
         </w:rPr>
         <w:t>在</w:t>
       </w:r>
+      <w:proofErr w:type="spellStart"/>
       <w:r>
         <w:rPr>
           <w:rFonts w:ascii="Times" w:eastAsia="SimSun" w:hAnsi="Times" w:cs="SimSun"/>
@@ -1035,6 +1098,7 @@
         </w:rPr>
         <w:t>owershell</w:t>
       </w:r>
+      <w:proofErr w:type="spellEnd"/>
       <w:r>
         <w:rPr>
           <w:rFonts w:ascii="Times" w:eastAsia="SimSun" w:hAnsi="Times" w:cs="SimSun"/>
@@ -1065,24 +1129,28 @@
         </w:rPr>
         <w:t>关掉</w:t>
       </w:r>
+      <w:proofErr w:type="spellStart"/>
       <w:r>
         <w:rPr>
           <w:rFonts w:ascii="Times" w:eastAsia="SimSun" w:hAnsi="Times" w:cs="SimSun"/>
         </w:rPr>
         <w:t>powershell</w:t>
       </w:r>
+      <w:proofErr w:type="spellEnd"/>
       <w:r>
         <w:rPr>
           <w:rFonts w:ascii="Times" w:eastAsia="SimSun" w:hAnsi="Times" w:cs="SimSun"/>
         </w:rPr>
         <w:t>然后重新打开一个新的</w:t>
       </w:r>
+      <w:proofErr w:type="spellStart"/>
       <w:r>
         <w:rPr>
           <w:rFonts w:ascii="Times" w:eastAsia="SimSun" w:hAnsi="Times" w:cs="SimSun"/>
         </w:rPr>
         <w:t>powershell</w:t>
       </w:r>
+      <w:proofErr w:type="spellEnd"/>
     </w:p>
     <w:p>
       <w:pPr>
@@ -1101,8 +1169,16 @@
         <w:rPr>
           <w:rFonts w:ascii="Times" w:eastAsia="SimSun" w:hAnsi="Times" w:cs="SimSun"/>
         </w:rPr>
-        <w:t xml:space="preserve"> wsl</w:t>
-      </w:r>
+        <w:t xml:space="preserve"> </w:t>
+      </w:r>
+      <w:proofErr w:type="spellStart"/>
+      <w:r>
+        <w:rPr>
+          <w:rFonts w:ascii="Times" w:eastAsia="SimSun" w:hAnsi="Times" w:cs="SimSun"/>
+        </w:rPr>
+        <w:t>wsl</w:t>
+      </w:r>
+      <w:proofErr w:type="spellEnd"/>
       <w:r>
         <w:rPr>
           <w:rFonts w:ascii="Times" w:eastAsia="SimSun" w:hAnsi="Times" w:cs="SimSun"/>
@@ -1150,7 +1226,7 @@
                     <pic:cNvPicPr/>
                   </pic:nvPicPr>
                   <pic:blipFill>
-                    <a:blip r:embed="rId6">
+                    <a:blip r:embed="rId5">
                       <a:extLst>
                         <a:ext uri="{28A0092B-C50C-407E-A947-70E740481C1C}">
                           <a14:useLocalDpi xmlns:a14="http://schemas.microsoft.com/office/drawing/2010/main" val="0"/>
@@ -1196,11 +1272,19 @@
         </w:rPr>
         <w:t xml:space="preserve"> </w:t>
       </w:r>
-      <w:r>
-        <w:rPr>
-          <w:rFonts w:ascii="Times" w:eastAsia="Times New Roman" w:hAnsi="Times" w:cs="Times New Roman"/>
-        </w:rPr>
-        <w:t>sudo apt-get update</w:t>
+      <w:proofErr w:type="spellStart"/>
+      <w:r>
+        <w:rPr>
+          <w:rFonts w:ascii="Times" w:eastAsia="Times New Roman" w:hAnsi="Times" w:cs="Times New Roman"/>
+        </w:rPr>
+        <w:t>sudo</w:t>
+      </w:r>
+      <w:proofErr w:type="spellEnd"/>
+      <w:r>
+        <w:rPr>
+          <w:rFonts w:ascii="Times" w:eastAsia="Times New Roman" w:hAnsi="Times" w:cs="Times New Roman"/>
+        </w:rPr>
+        <w:t xml:space="preserve"> apt-get update</w:t>
       </w:r>
     </w:p>
     <w:p>
@@ -1360,8 +1444,16 @@
         <w:rPr>
           <w:rFonts w:ascii="Times" w:eastAsia="SimSun" w:hAnsi="Times" w:cs="Times New Roman"/>
         </w:rPr>
-        <w:t>/mnt</w:t>
-      </w:r>
+        <w:t>/</w:t>
+      </w:r>
+      <w:proofErr w:type="spellStart"/>
+      <w:r>
+        <w:rPr>
+          <w:rFonts w:ascii="Times" w:eastAsia="SimSun" w:hAnsi="Times" w:cs="Times New Roman"/>
+        </w:rPr>
+        <w:t>mnt</w:t>
+      </w:r>
+      <w:proofErr w:type="spellEnd"/>
       <w:r>
         <w:rPr>
           <w:rFonts w:ascii="Times" w:eastAsia="SimSun" w:hAnsi="Times" w:cs="Times New Roman"/>
@@ -1386,8 +1478,27 @@
           <w:b/>
           <w:bCs/>
         </w:rPr>
-        <w:t>/mnt/d/</w:t>
-      </w:r>
+        <w:t>/</w:t>
+      </w:r>
+      <w:proofErr w:type="spellStart"/>
+      <w:r>
+        <w:rPr>
+          <w:rFonts w:ascii="Times" w:eastAsia="SimSun" w:hAnsi="Times" w:cs="Times New Roman"/>
+          <w:b/>
+          <w:bCs/>
+        </w:rPr>
+        <w:t>mnt</w:t>
+      </w:r>
+      <w:proofErr w:type="spellEnd"/>
+      <w:r>
+        <w:rPr>
+          <w:rFonts w:ascii="Times" w:eastAsia="SimSun" w:hAnsi="Times" w:cs="Times New Roman"/>
+          <w:b/>
+          <w:bCs/>
+        </w:rPr>
+        <w:t>/d/</w:t>
+      </w:r>
+      <w:proofErr w:type="spellStart"/>
       <w:r>
         <w:rPr>
           <w:rFonts w:ascii="Times" w:eastAsia="SimSun" w:hAnsi="Times" w:cs="Times New Roman"/>
@@ -1428,14 +1539,25 @@
         </w:rPr>
         <w:t>s</w:t>
       </w:r>
-      <w:r>
-        <w:rPr>
-          <w:rFonts w:ascii="Times" w:eastAsia="SimSun" w:hAnsi="Times" w:cs="Times New Roman"/>
-          <w:b/>
-          <w:bCs/>
-        </w:rPr>
-        <w:t>/docker_pytorch</w:t>
-      </w:r>
+      <w:proofErr w:type="spellEnd"/>
+      <w:r>
+        <w:rPr>
+          <w:rFonts w:ascii="Times" w:eastAsia="SimSun" w:hAnsi="Times" w:cs="Times New Roman"/>
+          <w:b/>
+          <w:bCs/>
+        </w:rPr>
+        <w:t>/</w:t>
+      </w:r>
+      <w:proofErr w:type="spellStart"/>
+      <w:r>
+        <w:rPr>
+          <w:rFonts w:ascii="Times" w:eastAsia="SimSun" w:hAnsi="Times" w:cs="Times New Roman"/>
+          <w:b/>
+          <w:bCs/>
+        </w:rPr>
+        <w:t>docker_pytorch</w:t>
+      </w:r>
+      <w:proofErr w:type="spellEnd"/>
     </w:p>
     <w:p>
       <w:pPr>
@@ -1482,13 +1604,30 @@
           <w:rFonts w:ascii="Times" w:eastAsia="SimSun" w:hAnsi="Times" w:cs="Times New Roman"/>
           <w:color w:val="4472C4" w:themeColor="accent1"/>
         </w:rPr>
-        <w:t>zhennongchen@5YPFKZ3:/mnt/d/</w:t>
-      </w:r>
+        <w:t>zhennongchen@5YPFKZ3:/</w:t>
+      </w:r>
+      <w:proofErr w:type="spellStart"/>
       <w:r>
         <w:rPr>
           <w:rFonts w:ascii="Times" w:eastAsia="SimSun" w:hAnsi="Times" w:cs="Times New Roman"/>
           <w:color w:val="4472C4" w:themeColor="accent1"/>
         </w:rPr>
+        <w:t>mnt</w:t>
+      </w:r>
+      <w:proofErr w:type="spellEnd"/>
+      <w:r>
+        <w:rPr>
+          <w:rFonts w:ascii="Times" w:eastAsia="SimSun" w:hAnsi="Times" w:cs="Times New Roman"/>
+          <w:color w:val="4472C4" w:themeColor="accent1"/>
+        </w:rPr>
+        <w:t>/d/</w:t>
+      </w:r>
+      <w:proofErr w:type="spellStart"/>
+      <w:r>
+        <w:rPr>
+          <w:rFonts w:ascii="Times" w:eastAsia="SimSun" w:hAnsi="Times" w:cs="Times New Roman"/>
+          <w:color w:val="4472C4" w:themeColor="accent1"/>
+        </w:rPr>
         <w:t>Standard_</w:t>
       </w:r>
       <w:r>
@@ -1505,28 +1644,29 @@
         </w:rPr>
         <w:t>s</w:t>
       </w:r>
+      <w:proofErr w:type="spellEnd"/>
       <w:r>
         <w:rPr>
           <w:rFonts w:ascii="Times" w:eastAsia="SimSun" w:hAnsi="Times" w:cs="Times New Roman"/>
           <w:color w:val="4472C4" w:themeColor="accent1"/>
         </w:rPr>
-        <w:t>/docker_pytorch$ ls</w:t>
-      </w:r>
-    </w:p>
-    <w:p>
-      <w:pPr>
-        <w:spacing w:before="100" w:beforeAutospacing="1" w:after="100" w:afterAutospacing="1" w:line="240" w:lineRule="auto"/>
+        <w:t>/</w:t>
+      </w:r>
+      <w:proofErr w:type="spellStart"/>
+      <w:r>
         <w:rPr>
           <w:rFonts w:ascii="Times" w:eastAsia="SimSun" w:hAnsi="Times" w:cs="Times New Roman"/>
           <w:color w:val="4472C4" w:themeColor="accent1"/>
         </w:rPr>
-      </w:pPr>
+        <w:t>docker_pytorch</w:t>
+      </w:r>
+      <w:proofErr w:type="spellEnd"/>
       <w:r>
         <w:rPr>
           <w:rFonts w:ascii="Times" w:eastAsia="SimSun" w:hAnsi="Times" w:cs="Times New Roman"/>
           <w:color w:val="4472C4" w:themeColor="accent1"/>
         </w:rPr>
-        <w:t>compile.sh          docker_build.sh  docker_run_compile.sh  entrypoint.sh     run_jupyter.sh</w:t>
+        <w:t>$ ls</w:t>
       </w:r>
     </w:p>
     <w:p>
@@ -1542,7 +1682,80 @@
           <w:rFonts w:ascii="Times" w:eastAsia="SimSun" w:hAnsi="Times" w:cs="Times New Roman"/>
           <w:color w:val="4472C4" w:themeColor="accent1"/>
         </w:rPr>
-        <w:t>docker-compose.yml  docker_run.sh    dockerfile             requirements.txt</w:t>
+        <w:t xml:space="preserve">compile.sh          </w:t>
+      </w:r>
+      <w:proofErr w:type="gramStart"/>
+      <w:r>
+        <w:rPr>
+          <w:rFonts w:ascii="Times" w:eastAsia="SimSun" w:hAnsi="Times" w:cs="Times New Roman"/>
+          <w:color w:val="4472C4" w:themeColor="accent1"/>
+        </w:rPr>
+        <w:t>docker_build.sh  docker_run_compile.sh</w:t>
+      </w:r>
+      <w:proofErr w:type="gramEnd"/>
+      <w:r>
+        <w:rPr>
+          <w:rFonts w:ascii="Times" w:eastAsia="SimSun" w:hAnsi="Times" w:cs="Times New Roman"/>
+          <w:color w:val="4472C4" w:themeColor="accent1"/>
+        </w:rPr>
+        <w:t xml:space="preserve">  entrypoint.sh     run_jupyter.sh</w:t>
+      </w:r>
+    </w:p>
+    <w:p>
+      <w:pPr>
+        <w:spacing w:before="100" w:beforeAutospacing="1" w:after="100" w:afterAutospacing="1" w:line="240" w:lineRule="auto"/>
+        <w:rPr>
+          <w:rFonts w:ascii="Times" w:eastAsia="SimSun" w:hAnsi="Times" w:cs="Times New Roman"/>
+          <w:color w:val="4472C4" w:themeColor="accent1"/>
+        </w:rPr>
+      </w:pPr>
+      <w:proofErr w:type="gramStart"/>
+      <w:r>
+        <w:rPr>
+          <w:rFonts w:ascii="Times" w:eastAsia="SimSun" w:hAnsi="Times" w:cs="Times New Roman"/>
+          <w:color w:val="4472C4" w:themeColor="accent1"/>
+        </w:rPr>
+        <w:t>docker-</w:t>
+      </w:r>
+      <w:proofErr w:type="spellStart"/>
+      <w:r>
+        <w:rPr>
+          <w:rFonts w:ascii="Times" w:eastAsia="SimSun" w:hAnsi="Times" w:cs="Times New Roman"/>
+          <w:color w:val="4472C4" w:themeColor="accent1"/>
+        </w:rPr>
+        <w:t>compose.yml</w:t>
+      </w:r>
+      <w:proofErr w:type="spellEnd"/>
+      <w:r>
+        <w:rPr>
+          <w:rFonts w:ascii="Times" w:eastAsia="SimSun" w:hAnsi="Times" w:cs="Times New Roman"/>
+          <w:color w:val="4472C4" w:themeColor="accent1"/>
+        </w:rPr>
+        <w:t xml:space="preserve">  docker_run.sh</w:t>
+      </w:r>
+      <w:proofErr w:type="gramEnd"/>
+      <w:r>
+        <w:rPr>
+          <w:rFonts w:ascii="Times" w:eastAsia="SimSun" w:hAnsi="Times" w:cs="Times New Roman"/>
+          <w:color w:val="4472C4" w:themeColor="accent1"/>
+        </w:rPr>
+        <w:t xml:space="preserve">    </w:t>
+      </w:r>
+      <w:proofErr w:type="spellStart"/>
+      <w:r>
+        <w:rPr>
+          <w:rFonts w:ascii="Times" w:eastAsia="SimSun" w:hAnsi="Times" w:cs="Times New Roman"/>
+          <w:color w:val="4472C4" w:themeColor="accent1"/>
+        </w:rPr>
+        <w:t>dockerfile</w:t>
+      </w:r>
+      <w:proofErr w:type="spellEnd"/>
+      <w:r>
+        <w:rPr>
+          <w:rFonts w:ascii="Times" w:eastAsia="SimSun" w:hAnsi="Times" w:cs="Times New Roman"/>
+          <w:color w:val="4472C4" w:themeColor="accent1"/>
+        </w:rPr>
+        <w:t xml:space="preserve">             requirements.txt</w:t>
       </w:r>
     </w:p>
     <w:p>
@@ -1676,7 +1889,7 @@
                     <pic:cNvPicPr/>
                   </pic:nvPicPr>
                   <pic:blipFill>
-                    <a:blip r:embed="rId7">
+                    <a:blip r:embed="rId6">
                       <a:extLst>
                         <a:ext uri="{28A0092B-C50C-407E-A947-70E740481C1C}">
                           <a14:useLocalDpi xmlns:a14="http://schemas.microsoft.com/office/drawing/2010/main" val="0"/>
@@ -1969,7 +2182,7 @@
                     <pic:cNvPicPr/>
                   </pic:nvPicPr>
                   <pic:blipFill>
-                    <a:blip r:embed="rId8">
+                    <a:blip r:embed="rId7">
                       <a:extLst>
                         <a:ext uri="{28A0092B-C50C-407E-A947-70E740481C1C}">
                           <a14:useLocalDpi xmlns:a14="http://schemas.microsoft.com/office/drawing/2010/main" val="0"/>
@@ -2123,7 +2336,7 @@
                     <pic:cNvPicPr/>
                   </pic:nvPicPr>
                   <pic:blipFill>
-                    <a:blip r:embed="rId9">
+                    <a:blip r:embed="rId8">
                       <a:extLst>
                         <a:ext uri="{28A0092B-C50C-407E-A947-70E740481C1C}">
                           <a14:useLocalDpi xmlns:a14="http://schemas.microsoft.com/office/drawing/2010/main" val="0"/>
@@ -2294,7 +2507,7 @@
                     <pic:cNvPicPr/>
                   </pic:nvPicPr>
                   <pic:blipFill>
-                    <a:blip r:embed="rId10">
+                    <a:blip r:embed="rId9">
                       <a:extLst>
                         <a:ext uri="{28A0092B-C50C-407E-A947-70E740481C1C}">
                           <a14:useLocalDpi xmlns:a14="http://schemas.microsoft.com/office/drawing/2010/main" val="0"/>
@@ -2468,7 +2681,21 @@
         <w:rPr>
           <w:rFonts w:ascii="Times" w:eastAsia="SimSun" w:hAnsi="Times" w:cs="Times New Roman"/>
         </w:rPr>
-        <w:t>FROM nvidia/cuda:11.0.3-cudnn8-devel-ubuntu20.04</w:t>
+        <w:t xml:space="preserve">FROM </w:t>
+      </w:r>
+      <w:proofErr w:type="spellStart"/>
+      <w:r>
+        <w:rPr>
+          <w:rFonts w:ascii="Times" w:eastAsia="SimSun" w:hAnsi="Times" w:cs="Times New Roman"/>
+        </w:rPr>
+        <w:t>nvidia</w:t>
+      </w:r>
+      <w:proofErr w:type="spellEnd"/>
+      <w:r>
+        <w:rPr>
+          <w:rFonts w:ascii="Times" w:eastAsia="SimSun" w:hAnsi="Times" w:cs="Times New Roman"/>
+        </w:rPr>
+        <w:t>/cuda:11.0.3-cudnn8-devel-ubuntu20.04</w:t>
       </w:r>
     </w:p>
     <w:p>
@@ -2484,12 +2711,14 @@
         </w:rPr>
         <w:t>然后去</w:t>
       </w:r>
+      <w:proofErr w:type="spellStart"/>
       <w:r>
         <w:rPr>
           <w:rFonts w:ascii="Times" w:eastAsia="SimSun" w:hAnsi="Times" w:cs="Times New Roman"/>
         </w:rPr>
         <w:t>wsl</w:t>
       </w:r>
+      <w:proofErr w:type="spellEnd"/>
       <w:r>
         <w:rPr>
           <w:rFonts w:ascii="Times" w:eastAsia="SimSun" w:hAnsi="Times" w:cs="Times New Roman"/>
@@ -2504,19 +2733,37 @@
         </w:rPr>
         <w:t>输入</w:t>
       </w:r>
-      <w:r>
-        <w:rPr>
-          <w:rFonts w:ascii="Times" w:eastAsia="SimSun" w:hAnsi="Times" w:cs="Times New Roman"/>
-          <w:b/>
-          <w:bCs/>
-        </w:rPr>
-        <w:t xml:space="preserve">sudo docker pull </w:t>
-      </w:r>
-      <w:r>
-        <w:rPr>
-          <w:rFonts w:ascii="Times" w:eastAsia="SimSun" w:hAnsi="Times" w:cs="Times New Roman"/>
-        </w:rPr>
-        <w:t>nvidia/cuda:11.0.3-cudnn8-devel-ubuntu20.04</w:t>
+      <w:proofErr w:type="spellStart"/>
+      <w:r>
+        <w:rPr>
+          <w:rFonts w:ascii="Times" w:eastAsia="SimSun" w:hAnsi="Times" w:cs="Times New Roman"/>
+          <w:b/>
+          <w:bCs/>
+        </w:rPr>
+        <w:t>sudo</w:t>
+      </w:r>
+      <w:proofErr w:type="spellEnd"/>
+      <w:r>
+        <w:rPr>
+          <w:rFonts w:ascii="Times" w:eastAsia="SimSun" w:hAnsi="Times" w:cs="Times New Roman"/>
+          <w:b/>
+          <w:bCs/>
+        </w:rPr>
+        <w:t xml:space="preserve"> docker pull </w:t>
+      </w:r>
+      <w:proofErr w:type="spellStart"/>
+      <w:r>
+        <w:rPr>
+          <w:rFonts w:ascii="Times" w:eastAsia="SimSun" w:hAnsi="Times" w:cs="Times New Roman"/>
+        </w:rPr>
+        <w:t>nvidia</w:t>
+      </w:r>
+      <w:proofErr w:type="spellEnd"/>
+      <w:r>
+        <w:rPr>
+          <w:rFonts w:ascii="Times" w:eastAsia="SimSun" w:hAnsi="Times" w:cs="Times New Roman"/>
+        </w:rPr>
+        <w:t>/cuda:11.0.3-cudnn8-devel-ubuntu20.04</w:t>
       </w:r>
     </w:p>
     <w:p>
@@ -2547,13 +2794,23 @@
         <w:lastRenderedPageBreak/>
         <w:t>即</w:t>
       </w:r>
-      <w:r>
-        <w:rPr>
-          <w:rFonts w:ascii="Times" w:eastAsia="SimSun" w:hAnsi="Times" w:cs="SimSun"/>
-          <w:b/>
-          <w:bCs/>
-        </w:rPr>
-        <w:t xml:space="preserve">sudo docker pull </w:t>
+      <w:proofErr w:type="spellStart"/>
+      <w:r>
+        <w:rPr>
+          <w:rFonts w:ascii="Times" w:eastAsia="SimSun" w:hAnsi="Times" w:cs="SimSun"/>
+          <w:b/>
+          <w:bCs/>
+        </w:rPr>
+        <w:t>sudo</w:t>
+      </w:r>
+      <w:proofErr w:type="spellEnd"/>
+      <w:r>
+        <w:rPr>
+          <w:rFonts w:ascii="Times" w:eastAsia="SimSun" w:hAnsi="Times" w:cs="SimSun"/>
+          <w:b/>
+          <w:bCs/>
+        </w:rPr>
+        <w:t xml:space="preserve"> docker pull </w:t>
       </w:r>
       <w:r>
         <w:rPr>
@@ -2847,11 +3104,19 @@
         </w:rPr>
         <w:t>输入</w:t>
       </w:r>
-      <w:r>
-        <w:rPr>
-          <w:rFonts w:ascii="Times" w:eastAsia="SimSun" w:hAnsi="Times" w:cs="SimSun"/>
-        </w:rPr>
-        <w:t>sudo docker image ls,</w:t>
+      <w:proofErr w:type="spellStart"/>
+      <w:r>
+        <w:rPr>
+          <w:rFonts w:ascii="Times" w:eastAsia="SimSun" w:hAnsi="Times" w:cs="SimSun"/>
+        </w:rPr>
+        <w:t>sudo</w:t>
+      </w:r>
+      <w:proofErr w:type="spellEnd"/>
+      <w:r>
+        <w:rPr>
+          <w:rFonts w:ascii="Times" w:eastAsia="SimSun" w:hAnsi="Times" w:cs="SimSun"/>
+        </w:rPr>
+        <w:t xml:space="preserve"> docker image ls,</w:t>
       </w:r>
       <w:r>
         <w:rPr>
@@ -2924,7 +3189,7 @@
                     <pic:cNvPicPr/>
                   </pic:nvPicPr>
                   <pic:blipFill>
-                    <a:blip r:embed="rId11">
+                    <a:blip r:embed="rId10">
                       <a:extLst>
                         <a:ext uri="{28A0092B-C50C-407E-A947-70E740481C1C}">
                           <a14:useLocalDpi xmlns:a14="http://schemas.microsoft.com/office/drawing/2010/main" val="0"/>
@@ -3032,12 +3297,14 @@
         </w:rPr>
         <w:t>在</w:t>
       </w:r>
+      <w:proofErr w:type="spellStart"/>
       <w:r>
         <w:rPr>
           <w:rFonts w:ascii="Times" w:eastAsia="SimSun" w:hAnsi="Times" w:cs="Times New Roman"/>
         </w:rPr>
         <w:t>wsl</w:t>
       </w:r>
+      <w:proofErr w:type="spellEnd"/>
       <w:r>
         <w:rPr>
           <w:rFonts w:ascii="Times" w:eastAsia="SimSun" w:hAnsi="Times" w:cs="Times New Roman"/>
@@ -3141,7 +3408,7 @@
                     <pic:cNvPicPr/>
                   </pic:nvPicPr>
                   <pic:blipFill>
-                    <a:blip r:embed="rId12">
+                    <a:blip r:embed="rId11">
                       <a:extLst>
                         <a:ext uri="{28A0092B-C50C-407E-A947-70E740481C1C}">
                           <a14:useLocalDpi xmlns:a14="http://schemas.microsoft.com/office/drawing/2010/main" val="0"/>
@@ -3234,7 +3501,7 @@
                     <pic:cNvPicPr/>
                   </pic:nvPicPr>
                   <pic:blipFill>
-                    <a:blip r:embed="rId13">
+                    <a:blip r:embed="rId12">
                       <a:extLst>
                         <a:ext uri="{28A0092B-C50C-407E-A947-70E740481C1C}">
                           <a14:useLocalDpi xmlns:a14="http://schemas.microsoft.com/office/drawing/2010/main" val="0"/>
@@ -3324,6 +3591,7 @@
         </w:rPr>
         <w:t>名字是</w:t>
       </w:r>
+      <w:proofErr w:type="spellStart"/>
       <w:r>
         <w:rPr>
           <w:rFonts w:ascii="Times" w:eastAsia="SimSun" w:hAnsi="Times" w:cs="SimSun"/>
@@ -3332,6 +3600,7 @@
         </w:rPr>
         <w:t>pytorch_container</w:t>
       </w:r>
+      <w:proofErr w:type="spellEnd"/>
       <w:r>
         <w:rPr>
           <w:rFonts w:ascii="Times" w:eastAsia="SimSun" w:hAnsi="Times" w:cs="SimSun" w:hint="eastAsia"/>
@@ -3471,6 +3740,7 @@
         </w:rPr>
         <w:t>（</w:t>
       </w:r>
+      <w:proofErr w:type="spellStart"/>
       <w:r>
         <w:rPr>
           <w:rFonts w:ascii="Times" w:eastAsia="SimSun" w:hAnsi="Times" w:cs="SimSun"/>
@@ -3479,6 +3749,7 @@
         </w:rPr>
         <w:t>C</w:t>
       </w:r>
+      <w:proofErr w:type="spellEnd"/>
       <w:r>
         <w:rPr>
           <w:rFonts w:ascii="Times" w:eastAsia="SimSun" w:hAnsi="Times" w:cs="SimSun"/>
@@ -3503,6 +3774,7 @@
         </w:rPr>
         <w:t>（</w:t>
       </w:r>
+      <w:proofErr w:type="spellStart"/>
       <w:r>
         <w:rPr>
           <w:rFonts w:ascii="Times" w:eastAsia="SimSun" w:hAnsi="Times" w:cs="SimSun"/>
@@ -3511,6 +3783,7 @@
         </w:rPr>
         <w:t>D</w:t>
       </w:r>
+      <w:proofErr w:type="spellEnd"/>
       <w:r>
         <w:rPr>
           <w:rFonts w:ascii="Times" w:eastAsia="SimSun" w:hAnsi="Times" w:cs="SimSun"/>
@@ -3601,17 +3874,27 @@
         </w:rPr>
         <w:t>地址栏输入</w:t>
       </w:r>
-      <w:hyperlink r:id="rId14" w:history="1">
-        <w:r>
-          <w:rPr>
-            <w:rStyle w:val="Hyperlink"/>
-            <w:rFonts w:ascii="Times" w:eastAsia="SimSun" w:hAnsi="Times" w:cs="Times New Roman"/>
-            <w:b/>
-            <w:bCs/>
-          </w:rPr>
-          <w:t>http://127.0.0.1:8888/lab</w:t>
-        </w:r>
-      </w:hyperlink>
+      <w:r>
+        <w:fldChar w:fldCharType="begin"/>
+      </w:r>
+      <w:r>
+        <w:instrText>HYPERLINK "http://127.0.0.1:8888/lab"</w:instrText>
+      </w:r>
+      <w:r>
+        <w:fldChar w:fldCharType="separate"/>
+      </w:r>
+      <w:r>
+        <w:rPr>
+          <w:rStyle w:val="Hyperlink"/>
+          <w:rFonts w:ascii="Times" w:eastAsia="SimSun" w:hAnsi="Times" w:cs="Times New Roman"/>
+          <w:b/>
+          <w:bCs/>
+        </w:rPr>
+        <w:t>http://127.0.0.1:8888/lab</w:t>
+      </w:r>
+      <w:r>
+        <w:fldChar w:fldCharType="end"/>
+      </w:r>
       <w:r>
         <w:rPr>
           <w:rFonts w:ascii="Times" w:eastAsia="SimSun" w:hAnsi="Times" w:cs="Times New Roman"/>
@@ -3620,6 +3903,7 @@
         </w:rPr>
         <w:t>，密码是</w:t>
       </w:r>
+      <w:proofErr w:type="spellStart"/>
       <w:r>
         <w:rPr>
           <w:rFonts w:ascii="Times" w:eastAsia="SimSun" w:hAnsi="Times" w:cs="Times New Roman"/>
@@ -3628,6 +3912,7 @@
         </w:rPr>
         <w:t>mypw</w:t>
       </w:r>
+      <w:proofErr w:type="spellEnd"/>
       <w:r>
         <w:rPr>
           <w:rFonts w:ascii="Times" w:eastAsia="SimSun" w:hAnsi="Times" w:cs="Times New Roman"/>
@@ -3663,7 +3948,7 @@
                     <pic:cNvPicPr/>
                   </pic:nvPicPr>
                   <pic:blipFill>
-                    <a:blip r:embed="rId15">
+                    <a:blip r:embed="rId13">
                       <a:extLst>
                         <a:ext uri="{28A0092B-C50C-407E-A947-70E740481C1C}">
                           <a14:useLocalDpi xmlns:a14="http://schemas.microsoft.com/office/drawing/2010/main" val="0"/>
@@ -3781,7 +4066,7 @@
                     <pic:cNvPicPr/>
                   </pic:nvPicPr>
                   <pic:blipFill>
-                    <a:blip r:embed="rId16">
+                    <a:blip r:embed="rId14">
                       <a:extLst>
                         <a:ext uri="{28A0092B-C50C-407E-A947-70E740481C1C}">
                           <a14:useLocalDpi xmlns:a14="http://schemas.microsoft.com/office/drawing/2010/main" val="0"/>
@@ -3841,6 +4126,7 @@
         </w:rPr>
         <w:t>：在</w:t>
       </w:r>
+      <w:proofErr w:type="spellStart"/>
       <w:r>
         <w:rPr>
           <w:rFonts w:ascii="Times" w:eastAsia="SimSun" w:hAnsi="Times" w:cs="SimSun"/>
@@ -3849,6 +4135,7 @@
         </w:rPr>
         <w:t>VSCode</w:t>
       </w:r>
+      <w:proofErr w:type="spellEnd"/>
       <w:r>
         <w:rPr>
           <w:rFonts w:ascii="Times" w:eastAsia="SimSun" w:hAnsi="Times" w:cs="SimSun"/>
@@ -3879,12 +4166,14 @@
         </w:rPr>
         <w:t>下载</w:t>
       </w:r>
+      <w:proofErr w:type="spellStart"/>
       <w:r>
         <w:rPr>
           <w:rFonts w:ascii="Times" w:eastAsia="SimSun" w:hAnsi="Times" w:cs="Times New Roman"/>
         </w:rPr>
         <w:t>VScode</w:t>
       </w:r>
+      <w:proofErr w:type="spellEnd"/>
       <w:r>
         <w:rPr>
           <w:rFonts w:ascii="Times" w:eastAsia="SimSun" w:hAnsi="Times" w:cs="Times New Roman"/>
@@ -4000,7 +4289,7 @@
                     <pic:cNvPicPr/>
                   </pic:nvPicPr>
                   <pic:blipFill>
-                    <a:blip r:embed="rId17">
+                    <a:blip r:embed="rId15">
                       <a:extLst>
                         <a:ext uri="{28A0092B-C50C-407E-A947-70E740481C1C}">
                           <a14:useLocalDpi xmlns:a14="http://schemas.microsoft.com/office/drawing/2010/main" val="0"/>
@@ -4118,7 +4407,7 @@
                     <pic:cNvPicPr/>
                   </pic:nvPicPr>
                   <pic:blipFill>
-                    <a:blip r:embed="rId18">
+                    <a:blip r:embed="rId16">
                       <a:extLst>
                         <a:ext uri="{28A0092B-C50C-407E-A947-70E740481C1C}">
                           <a14:useLocalDpi xmlns:a14="http://schemas.microsoft.com/office/drawing/2010/main" val="0"/>
@@ -4164,12 +4453,14 @@
         </w:rPr>
         <w:t>在</w:t>
       </w:r>
+      <w:proofErr w:type="spellStart"/>
       <w:r>
         <w:rPr>
           <w:rFonts w:ascii="Times" w:eastAsia="SimSun" w:hAnsi="Times" w:cs="Times New Roman"/>
         </w:rPr>
         <w:t>VSCode</w:t>
       </w:r>
+      <w:proofErr w:type="spellEnd"/>
       <w:r>
         <w:rPr>
           <w:rFonts w:ascii="Times" w:eastAsia="SimSun" w:hAnsi="Times" w:cs="Times New Roman" w:hint="eastAsia"/>
@@ -4198,7 +4489,7 @@
                     <pic:cNvPicPr/>
                   </pic:nvPicPr>
                   <pic:blipFill>
-                    <a:blip r:embed="rId19">
+                    <a:blip r:embed="rId17">
                       <a:extLst>
                         <a:ext uri="{28A0092B-C50C-407E-A947-70E740481C1C}">
                           <a14:useLocalDpi xmlns:a14="http://schemas.microsoft.com/office/drawing/2010/main" val="0"/>
@@ -4282,12 +4573,14 @@
         </w:rPr>
         <w:t>此时会新跳出来一个</w:t>
       </w:r>
+      <w:proofErr w:type="spellStart"/>
       <w:r>
         <w:rPr>
           <w:rFonts w:ascii="Times" w:eastAsia="SimSun" w:hAnsi="Times" w:cs="Times New Roman"/>
         </w:rPr>
         <w:t>vscode</w:t>
       </w:r>
+      <w:proofErr w:type="spellEnd"/>
       <w:r>
         <w:rPr>
           <w:rFonts w:ascii="Times" w:eastAsia="SimSun" w:hAnsi="Times" w:cs="Times New Roman"/>
@@ -4302,6 +4595,7 @@
         </w:rPr>
         <w:t>它的左下角应该是</w:t>
       </w:r>
+      <w:proofErr w:type="spellStart"/>
       <w:r>
         <w:rPr>
           <w:rFonts w:ascii="Times" w:eastAsia="SimSun" w:hAnsi="Times" w:cs="Times New Roman"/>
@@ -4310,6 +4604,7 @@
         </w:rPr>
         <w:t>ContainerXXX</w:t>
       </w:r>
+      <w:proofErr w:type="spellEnd"/>
       <w:r>
         <w:rPr>
           <w:rFonts w:ascii="Times" w:eastAsia="SimSun" w:hAnsi="Times" w:cs="Times New Roman"/>
@@ -4399,12 +4694,14 @@
         </w:rPr>
         <w:t>盘所有文件，说明此时在</w:t>
       </w:r>
+      <w:proofErr w:type="spellStart"/>
       <w:r>
         <w:rPr>
           <w:rFonts w:ascii="Times" w:eastAsia="SimSun" w:hAnsi="Times" w:cs="Times New Roman"/>
         </w:rPr>
         <w:t>vscode</w:t>
       </w:r>
+      <w:proofErr w:type="spellEnd"/>
       <w:r>
         <w:rPr>
           <w:rFonts w:ascii="Times" w:eastAsia="SimSun" w:hAnsi="Times" w:cs="Times New Roman"/>
@@ -4480,6 +4777,7 @@
         </w:rPr>
         <w:t>什么时候使用</w:t>
       </w:r>
+      <w:proofErr w:type="spellStart"/>
       <w:r>
         <w:rPr>
           <w:rFonts w:ascii="Times" w:eastAsia="SimSun" w:hAnsi="Times" w:cs="Times New Roman"/>
@@ -4488,6 +4786,7 @@
         </w:rPr>
         <w:t>VScode</w:t>
       </w:r>
+      <w:proofErr w:type="spellEnd"/>
       <w:r>
         <w:rPr>
           <w:rFonts w:ascii="Times" w:eastAsia="SimSun" w:hAnsi="Times" w:cs="Times New Roman"/>
@@ -4528,23 +4827,33 @@
           <w:rFonts w:ascii="Times" w:eastAsia="SimSun" w:hAnsi="Times" w:cs="Times New Roman"/>
         </w:rPr>
       </w:pPr>
+      <w:proofErr w:type="spellStart"/>
       <w:r>
         <w:rPr>
           <w:rFonts w:ascii="Times" w:eastAsia="SimSun" w:hAnsi="Times" w:cs="Times New Roman"/>
         </w:rPr>
         <w:t>VScode</w:t>
       </w:r>
+      <w:proofErr w:type="spellEnd"/>
       <w:r>
         <w:rPr>
           <w:rFonts w:ascii="Times" w:eastAsia="SimSun" w:hAnsi="Times" w:cs="Times New Roman"/>
         </w:rPr>
         <w:t>是用来写代码的，当你进入</w:t>
       </w:r>
-      <w:r>
-        <w:rPr>
-          <w:rFonts w:ascii="Times" w:eastAsia="SimSun" w:hAnsi="Times" w:cs="Times New Roman"/>
-        </w:rPr>
-        <w:t>vscode container</w:t>
+      <w:proofErr w:type="spellStart"/>
+      <w:r>
+        <w:rPr>
+          <w:rFonts w:ascii="Times" w:eastAsia="SimSun" w:hAnsi="Times" w:cs="Times New Roman"/>
+        </w:rPr>
+        <w:t>vscode</w:t>
+      </w:r>
+      <w:proofErr w:type="spellEnd"/>
+      <w:r>
+        <w:rPr>
+          <w:rFonts w:ascii="Times" w:eastAsia="SimSun" w:hAnsi="Times" w:cs="Times New Roman"/>
+        </w:rPr>
+        <w:t xml:space="preserve"> container</w:t>
       </w:r>
       <w:r>
         <w:rPr>
@@ -4608,12 +4917,14 @@
         </w:rPr>
         <w:t>运行文件的，当你在</w:t>
       </w:r>
+      <w:proofErr w:type="spellStart"/>
       <w:r>
         <w:rPr>
           <w:rFonts w:ascii="Times" w:eastAsia="SimSun" w:hAnsi="Times" w:cs="Times New Roman"/>
         </w:rPr>
         <w:t>VScode</w:t>
       </w:r>
+      <w:proofErr w:type="spellEnd"/>
       <w:r>
         <w:rPr>
           <w:rFonts w:ascii="Times" w:eastAsia="SimSun" w:hAnsi="Times" w:cs="Times New Roman"/>
@@ -4668,16 +4979,24 @@
         </w:rPr>
         <w:t>同时网页也有</w:t>
       </w:r>
+      <w:proofErr w:type="spellStart"/>
       <w:r>
         <w:rPr>
           <w:rFonts w:ascii="Times" w:eastAsia="SimSun" w:hAnsi="Times" w:cs="Times New Roman" w:hint="eastAsia"/>
         </w:rPr>
-        <w:t>jupyter notebook</w:t>
-      </w:r>
+        <w:t>jupyter</w:t>
+      </w:r>
+      <w:proofErr w:type="spellEnd"/>
       <w:r>
         <w:rPr>
           <w:rFonts w:ascii="Times" w:eastAsia="SimSun" w:hAnsi="Times" w:cs="Times New Roman" w:hint="eastAsia"/>
         </w:rPr>
+        <w:t xml:space="preserve"> notebook</w:t>
+      </w:r>
+      <w:r>
+        <w:rPr>
+          <w:rFonts w:ascii="Times" w:eastAsia="SimSun" w:hAnsi="Times" w:cs="Times New Roman" w:hint="eastAsia"/>
+        </w:rPr>
         <w:t>的功能（</w:t>
       </w:r>
       <w:r>
@@ -4692,12 +5011,14 @@
         </w:rPr>
         <w:t>那一栏），点进去可以创建</w:t>
       </w:r>
+      <w:proofErr w:type="spellStart"/>
       <w:r>
         <w:rPr>
           <w:rFonts w:ascii="Times" w:eastAsia="SimSun" w:hAnsi="Times" w:cs="Times New Roman" w:hint="eastAsia"/>
         </w:rPr>
         <w:t>jupyternotebook</w:t>
       </w:r>
+      <w:proofErr w:type="spellEnd"/>
       <w:r>
         <w:rPr>
           <w:rFonts w:ascii="Times" w:eastAsia="SimSun" w:hAnsi="Times" w:cs="Times New Roman" w:hint="eastAsia"/>
@@ -4733,7 +5054,7 @@
                     <pic:cNvPicPr/>
                   </pic:nvPicPr>
                   <pic:blipFill>
-                    <a:blip r:embed="rId15">
+                    <a:blip r:embed="rId13">
                       <a:extLst>
                         <a:ext uri="{28A0092B-C50C-407E-A947-70E740481C1C}">
                           <a14:useLocalDpi xmlns:a14="http://schemas.microsoft.com/office/drawing/2010/main" val="0"/>
@@ -4805,11 +5126,19 @@
         </w:rPr>
         <w:t>查看：</w:t>
       </w:r>
-      <w:r>
-        <w:rPr>
-          <w:rFonts w:ascii="Times" w:eastAsia="SimSun" w:hAnsi="Times" w:cs="Times New Roman"/>
-        </w:rPr>
-        <w:t>sudo docker image ls</w:t>
+      <w:proofErr w:type="spellStart"/>
+      <w:r>
+        <w:rPr>
+          <w:rFonts w:ascii="Times" w:eastAsia="SimSun" w:hAnsi="Times" w:cs="Times New Roman"/>
+        </w:rPr>
+        <w:t>sudo</w:t>
+      </w:r>
+      <w:proofErr w:type="spellEnd"/>
+      <w:r>
+        <w:rPr>
+          <w:rFonts w:ascii="Times" w:eastAsia="SimSun" w:hAnsi="Times" w:cs="Times New Roman"/>
+        </w:rPr>
+        <w:t xml:space="preserve"> docker image ls</w:t>
       </w:r>
     </w:p>
     <w:p>
@@ -4826,12 +5155,42 @@
         <w:lastRenderedPageBreak/>
         <w:t>删除：</w:t>
       </w:r>
-      <w:r>
-        <w:rPr>
-          <w:rFonts w:ascii="Times" w:eastAsia="SimSun" w:hAnsi="Times" w:cs="Times New Roman"/>
-        </w:rPr>
-        <w:t>sudo docker rmi image_ID</w:t>
-      </w:r>
+      <w:proofErr w:type="spellStart"/>
+      <w:r>
+        <w:rPr>
+          <w:rFonts w:ascii="Times" w:eastAsia="SimSun" w:hAnsi="Times" w:cs="Times New Roman"/>
+        </w:rPr>
+        <w:t>sudo</w:t>
+      </w:r>
+      <w:proofErr w:type="spellEnd"/>
+      <w:r>
+        <w:rPr>
+          <w:rFonts w:ascii="Times" w:eastAsia="SimSun" w:hAnsi="Times" w:cs="Times New Roman"/>
+        </w:rPr>
+        <w:t xml:space="preserve"> docker </w:t>
+      </w:r>
+      <w:proofErr w:type="spellStart"/>
+      <w:r>
+        <w:rPr>
+          <w:rFonts w:ascii="Times" w:eastAsia="SimSun" w:hAnsi="Times" w:cs="Times New Roman"/>
+        </w:rPr>
+        <w:t>rmi</w:t>
+      </w:r>
+      <w:proofErr w:type="spellEnd"/>
+      <w:r>
+        <w:rPr>
+          <w:rFonts w:ascii="Times" w:eastAsia="SimSun" w:hAnsi="Times" w:cs="Times New Roman"/>
+        </w:rPr>
+        <w:t xml:space="preserve"> </w:t>
+      </w:r>
+      <w:proofErr w:type="spellStart"/>
+      <w:r>
+        <w:rPr>
+          <w:rFonts w:ascii="Times" w:eastAsia="SimSun" w:hAnsi="Times" w:cs="Times New Roman"/>
+        </w:rPr>
+        <w:t>image_ID</w:t>
+      </w:r>
+      <w:proofErr w:type="spellEnd"/>
     </w:p>
     <w:p>
       <w:pPr>
@@ -4884,7 +5243,21 @@
         <w:rPr>
           <w:rFonts w:ascii="Times" w:eastAsia="SimSun" w:hAnsi="Times" w:cs="Times New Roman"/>
         </w:rPr>
-        <w:t xml:space="preserve"> sudo docker container ls</w:t>
+        <w:t xml:space="preserve"> </w:t>
+      </w:r>
+      <w:proofErr w:type="spellStart"/>
+      <w:r>
+        <w:rPr>
+          <w:rFonts w:ascii="Times" w:eastAsia="SimSun" w:hAnsi="Times" w:cs="Times New Roman"/>
+        </w:rPr>
+        <w:t>sudo</w:t>
+      </w:r>
+      <w:proofErr w:type="spellEnd"/>
+      <w:r>
+        <w:rPr>
+          <w:rFonts w:ascii="Times" w:eastAsia="SimSun" w:hAnsi="Times" w:cs="Times New Roman"/>
+        </w:rPr>
+        <w:t xml:space="preserve"> docker container ls</w:t>
       </w:r>
     </w:p>
     <w:p>
@@ -4900,11 +5273,33 @@
         </w:rPr>
         <w:t>删除：先</w:t>
       </w:r>
-      <w:r>
-        <w:rPr>
-          <w:rFonts w:ascii="Times" w:eastAsia="SimSun" w:hAnsi="Times" w:cs="Times New Roman"/>
-        </w:rPr>
-        <w:t xml:space="preserve">sudo docker container stop container_ID, </w:t>
+      <w:proofErr w:type="spellStart"/>
+      <w:r>
+        <w:rPr>
+          <w:rFonts w:ascii="Times" w:eastAsia="SimSun" w:hAnsi="Times" w:cs="Times New Roman"/>
+        </w:rPr>
+        <w:t>sudo</w:t>
+      </w:r>
+      <w:proofErr w:type="spellEnd"/>
+      <w:r>
+        <w:rPr>
+          <w:rFonts w:ascii="Times" w:eastAsia="SimSun" w:hAnsi="Times" w:cs="Times New Roman"/>
+        </w:rPr>
+        <w:t xml:space="preserve"> docker container stop </w:t>
+      </w:r>
+      <w:proofErr w:type="spellStart"/>
+      <w:r>
+        <w:rPr>
+          <w:rFonts w:ascii="Times" w:eastAsia="SimSun" w:hAnsi="Times" w:cs="Times New Roman"/>
+        </w:rPr>
+        <w:t>container_ID</w:t>
+      </w:r>
+      <w:proofErr w:type="spellEnd"/>
+      <w:r>
+        <w:rPr>
+          <w:rFonts w:ascii="Times" w:eastAsia="SimSun" w:hAnsi="Times" w:cs="Times New Roman"/>
+        </w:rPr>
+        <w:t xml:space="preserve">, </w:t>
       </w:r>
       <w:r>
         <w:rPr>
@@ -4912,12 +5307,28 @@
         </w:rPr>
         <w:t>然后再</w:t>
       </w:r>
-      <w:r>
-        <w:rPr>
-          <w:rFonts w:ascii="Times" w:eastAsia="SimSun" w:hAnsi="Times" w:cs="Times New Roman"/>
-        </w:rPr>
-        <w:t>sudo docker container rm container_ID</w:t>
-      </w:r>
+      <w:proofErr w:type="spellStart"/>
+      <w:r>
+        <w:rPr>
+          <w:rFonts w:ascii="Times" w:eastAsia="SimSun" w:hAnsi="Times" w:cs="Times New Roman"/>
+        </w:rPr>
+        <w:t>sudo</w:t>
+      </w:r>
+      <w:proofErr w:type="spellEnd"/>
+      <w:r>
+        <w:rPr>
+          <w:rFonts w:ascii="Times" w:eastAsia="SimSun" w:hAnsi="Times" w:cs="Times New Roman"/>
+        </w:rPr>
+        <w:t xml:space="preserve"> docker container rm </w:t>
+      </w:r>
+      <w:proofErr w:type="spellStart"/>
+      <w:r>
+        <w:rPr>
+          <w:rFonts w:ascii="Times" w:eastAsia="SimSun" w:hAnsi="Times" w:cs="Times New Roman"/>
+        </w:rPr>
+        <w:t>container_ID</w:t>
+      </w:r>
+      <w:proofErr w:type="spellEnd"/>
     </w:p>
     <w:p>
       <w:pPr>
@@ -4998,12 +5409,14 @@
         </w:rPr>
         <w:t>先进入</w:t>
       </w:r>
+      <w:proofErr w:type="spellStart"/>
       <w:r>
         <w:rPr>
           <w:rFonts w:ascii="Times" w:eastAsia="SimSun" w:hAnsi="Times" w:cs="Times New Roman" w:hint="eastAsia"/>
         </w:rPr>
         <w:t>wsl</w:t>
       </w:r>
+      <w:proofErr w:type="spellEnd"/>
     </w:p>
     <w:p>
       <w:pPr>
@@ -5018,11 +5431,19 @@
         </w:rPr>
         <w:t>然后</w:t>
       </w:r>
-      <w:r>
-        <w:rPr>
-          <w:rFonts w:ascii="Times" w:eastAsia="SimSun" w:hAnsi="Times" w:cs="Times New Roman"/>
-        </w:rPr>
-        <w:t>sudo docker container ls</w:t>
+      <w:proofErr w:type="spellStart"/>
+      <w:r>
+        <w:rPr>
+          <w:rFonts w:ascii="Times" w:eastAsia="SimSun" w:hAnsi="Times" w:cs="Times New Roman"/>
+        </w:rPr>
+        <w:t>sudo</w:t>
+      </w:r>
+      <w:proofErr w:type="spellEnd"/>
+      <w:r>
+        <w:rPr>
+          <w:rFonts w:ascii="Times" w:eastAsia="SimSun" w:hAnsi="Times" w:cs="Times New Roman"/>
+        </w:rPr>
+        <w:t xml:space="preserve"> docker container ls</w:t>
       </w:r>
       <w:r>
         <w:rPr>
@@ -5062,11 +5483,19 @@
         </w:rPr>
         <w:t>然后在</w:t>
       </w:r>
-      <w:r>
-        <w:rPr>
-          <w:rFonts w:ascii="Times" w:eastAsia="SimSun" w:hAnsi="Times" w:cs="Times New Roman"/>
-        </w:rPr>
-        <w:t>wsl terminal</w:t>
+      <w:proofErr w:type="spellStart"/>
+      <w:r>
+        <w:rPr>
+          <w:rFonts w:ascii="Times" w:eastAsia="SimSun" w:hAnsi="Times" w:cs="Times New Roman"/>
+        </w:rPr>
+        <w:t>wsl</w:t>
+      </w:r>
+      <w:proofErr w:type="spellEnd"/>
+      <w:r>
+        <w:rPr>
+          <w:rFonts w:ascii="Times" w:eastAsia="SimSun" w:hAnsi="Times" w:cs="Times New Roman"/>
+        </w:rPr>
+        <w:t xml:space="preserve"> terminal</w:t>
       </w:r>
       <w:r>
         <w:rPr>
@@ -5074,11 +5503,19 @@
         </w:rPr>
         <w:t>里</w:t>
       </w:r>
-      <w:r>
-        <w:rPr>
-          <w:rFonts w:ascii="Times" w:eastAsia="SimSun" w:hAnsi="Times" w:cs="Times New Roman"/>
-        </w:rPr>
-        <w:t>sudo docker exec -it -u 0 ID bash</w:t>
+      <w:proofErr w:type="spellStart"/>
+      <w:r>
+        <w:rPr>
+          <w:rFonts w:ascii="Times" w:eastAsia="SimSun" w:hAnsi="Times" w:cs="Times New Roman"/>
+        </w:rPr>
+        <w:t>sudo</w:t>
+      </w:r>
+      <w:proofErr w:type="spellEnd"/>
+      <w:r>
+        <w:rPr>
+          <w:rFonts w:ascii="Times" w:eastAsia="SimSun" w:hAnsi="Times" w:cs="Times New Roman"/>
+        </w:rPr>
+        <w:t xml:space="preserve"> docker exec -it -u 0 ID bash</w:t>
       </w:r>
     </w:p>
     <w:p>
@@ -5144,12 +5581,14 @@
         </w:rPr>
         <w:t>安装好后</w:t>
       </w:r>
+      <w:proofErr w:type="spellStart"/>
       <w:r>
         <w:rPr>
           <w:rFonts w:ascii="Times" w:eastAsia="SimSun" w:hAnsi="Times" w:cs="Times New Roman"/>
         </w:rPr>
         <w:t>ctrl+A+D</w:t>
       </w:r>
+      <w:proofErr w:type="spellEnd"/>
       <w:r>
         <w:rPr>
           <w:rFonts w:ascii="Times" w:eastAsia="SimSun" w:hAnsi="Times" w:cs="Times New Roman"/>
@@ -5308,8 +5747,30 @@
         <w:rPr>
           <w:rFonts w:ascii="Times" w:eastAsia="SimSun" w:hAnsi="Times" w:cs="Times New Roman"/>
         </w:rPr>
-        <w:t>(base) root@cf50883f4616:/host# unset HTTP_PROXY HTTPS_PROXY http_proxy https_proxy</w:t>
-      </w:r>
+        <w:t xml:space="preserve">(base) root@cf50883f4616:/host# unset HTTP_PROXY HTTPS_PROXY </w:t>
+      </w:r>
+      <w:proofErr w:type="spellStart"/>
+      <w:r>
+        <w:rPr>
+          <w:rFonts w:ascii="Times" w:eastAsia="SimSun" w:hAnsi="Times" w:cs="Times New Roman"/>
+        </w:rPr>
+        <w:t>http_proxy</w:t>
+      </w:r>
+      <w:proofErr w:type="spellEnd"/>
+      <w:r>
+        <w:rPr>
+          <w:rFonts w:ascii="Times" w:eastAsia="SimSun" w:hAnsi="Times" w:cs="Times New Roman"/>
+        </w:rPr>
+        <w:t xml:space="preserve"> </w:t>
+      </w:r>
+      <w:proofErr w:type="spellStart"/>
+      <w:r>
+        <w:rPr>
+          <w:rFonts w:ascii="Times" w:eastAsia="SimSun" w:hAnsi="Times" w:cs="Times New Roman"/>
+        </w:rPr>
+        <w:t>https_proxy</w:t>
+      </w:r>
+      <w:proofErr w:type="spellEnd"/>
     </w:p>
     <w:p>
       <w:pPr>
@@ -5350,7 +5811,21 @@
         <w:rPr>
           <w:rFonts w:ascii="Times" w:eastAsia="SimSun" w:hAnsi="Times" w:cs="Times New Roman"/>
         </w:rPr>
-        <w:t>(base) root@cf50883f4616:/host# export NO_PROXY=localhost,127.0.0.1,::1</w:t>
+        <w:t>(base) root@cf50883f4616:/host# export NO_PROXY=localhost,127.0.</w:t>
+      </w:r>
+      <w:proofErr w:type="gramStart"/>
+      <w:r>
+        <w:rPr>
+          <w:rFonts w:ascii="Times" w:eastAsia="SimSun" w:hAnsi="Times" w:cs="Times New Roman"/>
+        </w:rPr>
+        <w:t>0.1,::</w:t>
+      </w:r>
+      <w:proofErr w:type="gramEnd"/>
+      <w:r>
+        <w:rPr>
+          <w:rFonts w:ascii="Times" w:eastAsia="SimSun" w:hAnsi="Times" w:cs="Times New Roman"/>
+        </w:rPr>
+        <w:t>1</w:t>
       </w:r>
     </w:p>
     <w:p>

</xml_diff>